<commit_message>
Square brackets manual fix
</commit_message>
<xml_diff>
--- a/bank/task_09/variant_04.docx
+++ b/bank/task_09/variant_04.docx
@@ -202,7 +202,25 @@
             <w:bdr w:val="none" w:sz="0" w:space="0" w:color="auto" w:frame="1"/>
             <w:lang w:eastAsia="ru-RU"/>
           </w:rPr>
-          <m:t>a&lt;-</m:t>
+          <m:t>a&lt;</m:t>
+        </m:r>
+        <m:r>
+          <w:rPr>
+            <w:rFonts w:ascii="Cambria Math" w:eastAsia="Times New Roman" w:hAnsi="Cambria Math"/>
+            <w:szCs w:val="28"/>
+            <w:bdr w:val="none" w:sz="0" w:space="0" w:color="auto" w:frame="1"/>
+            <w:lang w:eastAsia="ru-RU"/>
+          </w:rPr>
+          <m:t xml:space="preserve"> </m:t>
+        </m:r>
+        <m:r>
+          <w:rPr>
+            <w:rFonts w:ascii="Cambria Math" w:eastAsia="Times New Roman" w:hAnsi="Cambria Math"/>
+            <w:szCs w:val="28"/>
+            <w:bdr w:val="none" w:sz="0" w:space="0" w:color="auto" w:frame="1"/>
+            <w:lang w:eastAsia="ru-RU"/>
+          </w:rPr>
+          <m:t>-</m:t>
         </m:r>
         <m:f>
           <m:fPr>
@@ -335,7 +353,25 @@
             <w:bdr w:val="none" w:sz="0" w:space="0" w:color="auto" w:frame="1"/>
             <w:lang w:eastAsia="ru-RU"/>
           </w:rPr>
-          <m:t>a&lt;-</m:t>
+          <m:t>a&lt;</m:t>
+        </m:r>
+        <m:r>
+          <w:rPr>
+            <w:rFonts w:ascii="Cambria Math" w:eastAsia="Times New Roman" w:hAnsi="Cambria Math"/>
+            <w:szCs w:val="28"/>
+            <w:bdr w:val="none" w:sz="0" w:space="0" w:color="auto" w:frame="1"/>
+            <w:lang w:eastAsia="ru-RU"/>
+          </w:rPr>
+          <m:t xml:space="preserve"> </m:t>
+        </m:r>
+        <m:r>
+          <w:rPr>
+            <w:rFonts w:ascii="Cambria Math" w:eastAsia="Times New Roman" w:hAnsi="Cambria Math"/>
+            <w:szCs w:val="28"/>
+            <w:bdr w:val="none" w:sz="0" w:space="0" w:color="auto" w:frame="1"/>
+            <w:lang w:eastAsia="ru-RU"/>
+          </w:rPr>
+          <m:t>-</m:t>
         </m:r>
         <m:f>
           <m:fPr>

</xml_diff>